<commit_message>
Add MC answer-key worked rationales for all 10 chapters (110 entries)
Each chapter's "Multiple Choice Practice Test" now has an "Answer Key —
Worked Rationales" sub-section appended after the terse one-line answer
key (which is preserved for quick scanning). One paragraph per
question: bold question number, the correct letter, and an italic
1–2-sentence rationale. Math questions show a brief factor-label
calculation; conceptual questions give one sentence on why the chosen
answer is right.

Counts: Ch 1 has 20 questions (its longer practice test), all other
chapters have 10. Total: 110 rationale paragraphs.

Idempotency guard: re-runs are no-ops because each insertion check looks
for "Worked Rationales" before adding.

CHEM_139_OER.imscc rebuilt to include the updated answer keys.

Co-Authored-By: Claude Opus 4.7 (1M context) <noreply@anthropic.com>
</commit_message>
<xml_diff>
--- a/Chapter_01_Science_and_Measurement.docx
+++ b/Chapter_01_Science_and_Measurement.docx
@@ -8587,6 +8587,417 @@
         </w:rPr>
         <w:t xml:space="preserve">
 Answer Key:</w:t>
+      </w:r>
+    </w:p>
+    <w:p>
+      <w:pPr>
+        <w:spacing w:after="60" w:line="300"/>
+      </w:pPr>
+      <w:r>
+        <w:rPr>
+          <w:b/>
+        </w:rPr>
+        <w:t>Answer Key — Worked Rationales</w:t>
+      </w:r>
+    </w:p>
+    <w:p>
+      <w:pPr>
+        <w:spacing w:after="60" w:line="300"/>
+      </w:pPr>
+      <w:r>
+        <w:rPr>
+          <w:b/>
+        </w:rPr>
+        <w:t xml:space="preserve">1. </w:t>
+      </w:r>
+      <w:r>
+        <w:t xml:space="preserve">B. </w:t>
+      </w:r>
+      <w:r>
+        <w:rPr>
+          <w:i/>
+        </w:rPr>
+        <w:t>Chemistry is the study of matter and the changes it undergoes (standard definition).</w:t>
+      </w:r>
+    </w:p>
+    <w:p>
+      <w:pPr>
+        <w:spacing w:after="60" w:line="300"/>
+      </w:pPr>
+      <w:r>
+        <w:rPr>
+          <w:b/>
+        </w:rPr>
+        <w:t xml:space="preserve">2. </w:t>
+      </w:r>
+      <w:r>
+        <w:t xml:space="preserve">B. </w:t>
+      </w:r>
+      <w:r>
+        <w:rPr>
+          <w:i/>
+        </w:rPr>
+        <w:t>Atomic theory — atoms make up matter and combine in fixed ratios — is a well-tested broad explanation: a scientific theory.</w:t>
+      </w:r>
+    </w:p>
+    <w:p>
+      <w:pPr>
+        <w:spacing w:after="60" w:line="300"/>
+      </w:pPr>
+      <w:r>
+        <w:rPr>
+          <w:b/>
+        </w:rPr>
+        <w:t xml:space="preserve">3. </w:t>
+      </w:r>
+      <w:r>
+        <w:t xml:space="preserve">B. </w:t>
+      </w:r>
+      <w:r>
+        <w:rPr>
+          <w:i/>
+        </w:rPr>
+        <w:t>E = mc² states a quantitative pattern (energy and mass are equivalent at rest) — a scientific law, summarising behaviour without explaining mechanism.</w:t>
+      </w:r>
+    </w:p>
+    <w:p>
+      <w:pPr>
+        <w:spacing w:after="60" w:line="300"/>
+      </w:pPr>
+      <w:r>
+        <w:rPr>
+          <w:b/>
+        </w:rPr>
+        <w:t xml:space="preserve">4. </w:t>
+      </w:r>
+      <w:r>
+        <w:t xml:space="preserve">C. </w:t>
+      </w:r>
+      <w:r>
+        <w:rPr>
+          <w:i/>
+        </w:rPr>
+        <w:t>A hypothesis must be falsifiable: it has to make a risky prediction that observation could in principle refute.</w:t>
+      </w:r>
+    </w:p>
+    <w:p>
+      <w:pPr>
+        <w:spacing w:after="60" w:line="300"/>
+      </w:pPr>
+      <w:r>
+        <w:rPr>
+          <w:b/>
+        </w:rPr>
+        <w:t xml:space="preserve">5. </w:t>
+      </w:r>
+      <w:r>
+        <w:t xml:space="preserve">B. </w:t>
+      </w:r>
+      <w:r>
+        <w:rPr>
+          <w:i/>
+        </w:rPr>
+        <w:t>Ethical questions are normative ("is X right?") rather than empirical; they cannot be settled by measurement.</w:t>
+      </w:r>
+    </w:p>
+    <w:p>
+      <w:pPr>
+        <w:spacing w:after="60" w:line="300"/>
+      </w:pPr>
+      <w:r>
+        <w:rPr>
+          <w:b/>
+        </w:rPr>
+        <w:t xml:space="preserve">6. </w:t>
+      </w:r>
+      <w:r>
+        <w:t xml:space="preserve">B. </w:t>
+      </w:r>
+      <w:r>
+        <w:rPr>
+          <w:i/>
+        </w:rPr>
+        <w:t>Defined relationships are exact. "60 seconds per 1 minute" comes from the SI definition; the others involve measurement.</w:t>
+      </w:r>
+    </w:p>
+    <w:p>
+      <w:pPr>
+        <w:spacing w:after="60" w:line="300"/>
+      </w:pPr>
+      <w:r>
+        <w:rPr>
+          <w:b/>
+        </w:rPr>
+        <w:t xml:space="preserve">7. </w:t>
+      </w:r>
+      <w:r>
+        <w:t xml:space="preserve">C. </w:t>
+      </w:r>
+      <w:r>
+        <w:rPr>
+          <w:i/>
+        </w:rPr>
+        <w:t>The data cluster tightly (precise) but sit far from the true value 7.00 — accurate they are not.</w:t>
+      </w:r>
+    </w:p>
+    <w:p>
+      <w:pPr>
+        <w:spacing w:after="60" w:line="300"/>
+      </w:pPr>
+      <w:r>
+        <w:rPr>
+          <w:b/>
+        </w:rPr>
+        <w:t xml:space="preserve">8. </w:t>
+      </w:r>
+      <w:r>
+        <w:t xml:space="preserve">B. </w:t>
+      </w:r>
+      <w:r>
+        <w:rPr>
+          <w:i/>
+        </w:rPr>
+        <w:t>0.005020 has 4 sig figs: leading zeros don't count; the captive 0 between 5 and 2 counts; the trailing 0 (after a decimal point) counts.</w:t>
+      </w:r>
+    </w:p>
+    <w:p>
+      <w:pPr>
+        <w:spacing w:after="60" w:line="300"/>
+      </w:pPr>
+      <w:r>
+        <w:rPr>
+          <w:b/>
+        </w:rPr>
+        <w:t xml:space="preserve">9. </w:t>
+      </w:r>
+      <w:r>
+        <w:t xml:space="preserve">C. </w:t>
+      </w:r>
+      <w:r>
+        <w:rPr>
+          <w:i/>
+        </w:rPr>
+        <w:t>4.0080 has 5 sig figs: 4, the captive 0, 0, 8, and the trailing 0 (made significant by the decimal point).</w:t>
+      </w:r>
+    </w:p>
+    <w:p>
+      <w:pPr>
+        <w:spacing w:after="60" w:line="300"/>
+      </w:pPr>
+      <w:r>
+        <w:rPr>
+          <w:b/>
+        </w:rPr>
+        <w:t xml:space="preserve">10. </w:t>
+      </w:r>
+      <w:r>
+        <w:t xml:space="preserve">C. </w:t>
+      </w:r>
+      <w:r>
+        <w:rPr>
+          <w:i/>
+        </w:rPr>
+        <w:t>Addition is limited by the least precise decimal place; "12 g" has none, so 3.14 + 0.5 + 12 = 15.64 rounds to 16 g.</w:t>
+      </w:r>
+    </w:p>
+    <w:p>
+      <w:pPr>
+        <w:spacing w:after="60" w:line="300"/>
+      </w:pPr>
+      <w:r>
+        <w:rPr>
+          <w:b/>
+        </w:rPr>
+        <w:t xml:space="preserve">11. </w:t>
+      </w:r>
+      <w:r>
+        <w:t xml:space="preserve">B. </w:t>
+      </w:r>
+      <w:r>
+        <w:rPr>
+          <w:i/>
+        </w:rPr>
+        <w:t>(5.0 × 10²) × (2.50 × 10⁻⁴) = 1.25 × 10⁻¹; multiplication is limited by the input with fewest sig figs (5.0 has 2) → 1.3 × 10⁻¹.</w:t>
+      </w:r>
+    </w:p>
+    <w:p>
+      <w:pPr>
+        <w:spacing w:after="60" w:line="300"/>
+      </w:pPr>
+      <w:r>
+        <w:rPr>
+          <w:b/>
+        </w:rPr>
+        <w:t xml:space="preserve">12. </w:t>
+      </w:r>
+      <w:r>
+        <w:t xml:space="preserve">B. </w:t>
+      </w:r>
+      <w:r>
+        <w:rPr>
+          <w:i/>
+        </w:rPr>
+        <w:t>3 sig figs from "3,200,000" requires explicit precision: 3.20 × 10⁶.</w:t>
+      </w:r>
+    </w:p>
+    <w:p>
+      <w:pPr>
+        <w:spacing w:after="60" w:line="300"/>
+      </w:pPr>
+      <w:r>
+        <w:rPr>
+          <w:b/>
+        </w:rPr>
+        <w:t xml:space="preserve">13. </w:t>
+      </w:r>
+      <w:r>
+        <w:t xml:space="preserve">A. </w:t>
+      </w:r>
+      <w:r>
+        <w:rPr>
+          <w:i/>
+        </w:rPr>
+        <w:t>0.0000102 → move the decimal 5 places to the right → 1.02 × 10⁻⁵.</w:t>
+      </w:r>
+    </w:p>
+    <w:p>
+      <w:pPr>
+        <w:spacing w:after="60" w:line="300"/>
+      </w:pPr>
+      <w:r>
+        <w:rPr>
+          <w:b/>
+        </w:rPr>
+        <w:t xml:space="preserve">14. </w:t>
+      </w:r>
+      <w:r>
+        <w:t xml:space="preserve">A. </w:t>
+      </w:r>
+      <w:r>
+        <w:rPr>
+          <w:i/>
+        </w:rPr>
+        <w:t>Random errors scatter symmetrically around the true value; averaging cancels them. Systematic errors all bias the same direction and survive averaging.</w:t>
+      </w:r>
+    </w:p>
+    <w:p>
+      <w:pPr>
+        <w:spacing w:after="60" w:line="300"/>
+      </w:pPr>
+      <w:r>
+        <w:rPr>
+          <w:b/>
+        </w:rPr>
+        <w:t xml:space="preserve">15. </w:t>
+      </w:r>
+      <w:r>
+        <w:t xml:space="preserve">B. </w:t>
+      </w:r>
+      <w:r>
+        <w:rPr>
+          <w:i/>
+        </w:rPr>
+        <w:t>Systematic error is a consistent bias (a miscalibrated balance, an offset thermometer); the cure is recalibration, not more measurements.</w:t>
+      </w:r>
+    </w:p>
+    <w:p>
+      <w:pPr>
+        <w:spacing w:after="60" w:line="300"/>
+      </w:pPr>
+      <w:r>
+        <w:rPr>
+          <w:b/>
+        </w:rPr>
+        <w:t xml:space="preserve">16. </w:t>
+      </w:r>
+      <w:r>
+        <w:t xml:space="preserve">C. </w:t>
+      </w:r>
+      <w:r>
+        <w:rPr>
+          <w:i/>
+        </w:rPr>
+        <w:t>(8.40 × 10⁵) / (2.0 × 10²) = 4.2 × 10³; 2 sig figs are the limit (from 2.0).</w:t>
+      </w:r>
+    </w:p>
+    <w:p>
+      <w:pPr>
+        <w:spacing w:after="60" w:line="300"/>
+      </w:pPr>
+      <w:r>
+        <w:rPr>
+          <w:b/>
+        </w:rPr>
+        <w:t xml:space="preserve">17. </w:t>
+      </w:r>
+      <w:r>
+        <w:t xml:space="preserve">A. </w:t>
+      </w:r>
+      <w:r>
+        <w:rPr>
+          <w:i/>
+        </w:rPr>
+        <w:t>4.50 × 10⁻³ − 0.12 × 10⁻³ = 4.38 × 10⁻³; the input "1.2 × 10⁻⁴" carries only 2 sig figs, governing the result → 4.4 × 10⁻³.</w:t>
+      </w:r>
+    </w:p>
+    <w:p>
+      <w:pPr>
+        <w:spacing w:after="60" w:line="300"/>
+      </w:pPr>
+      <w:r>
+        <w:rPr>
+          <w:b/>
+        </w:rPr>
+        <w:t xml:space="preserve">18. </w:t>
+      </w:r>
+      <w:r>
+        <w:t xml:space="preserve">B. </w:t>
+      </w:r>
+      <w:r>
+        <w:rPr>
+          <w:i/>
+        </w:rPr>
+        <w:t>Kinetic-molecular theory is a broad, well-tested explanation of gas behaviour — a scientific theory.</w:t>
+      </w:r>
+    </w:p>
+    <w:p>
+      <w:pPr>
+        <w:spacing w:after="60" w:line="300"/>
+      </w:pPr>
+      <w:r>
+        <w:rPr>
+          <w:b/>
+        </w:rPr>
+        <w:t xml:space="preserve">19. </w:t>
+      </w:r>
+      <w:r>
+        <w:t xml:space="preserve">B. </w:t>
+      </w:r>
+      <w:r>
+        <w:rPr>
+          <w:i/>
+        </w:rPr>
+        <w:t>Forming a tentative explanation that can be tested is the hypothesis step.</w:t>
+      </w:r>
+    </w:p>
+    <w:p>
+      <w:pPr>
+        <w:spacing w:after="60" w:line="300"/>
+      </w:pPr>
+      <w:r>
+        <w:rPr>
+          <w:b/>
+        </w:rPr>
+        <w:t xml:space="preserve">20. </w:t>
+      </w:r>
+      <w:r>
+        <w:t xml:space="preserve">B. </w:t>
+      </w:r>
+      <w:r>
+        <w:rPr>
+          <w:i/>
+        </w:rPr>
+        <w:t>1 in = 2.54 cm was defined exactly by international agreement in 1959; the others are measured (or differ slightly across definitions).</w:t>
       </w:r>
     </w:p>
     <w:p>

</xml_diff>